<commit_message>
snapshot: update dashboards + add new exports/docx
Co-Authored-By: Claude Opus 4.8 (1M context) <noreply@anthropic.com>
</commit_message>
<xml_diff>
--- a/משימות_הערות_טובה_נורית.docx
+++ b/משימות_הערות_טובה_נורית.docx
@@ -57,12 +57,6 @@
         <w:gridCol w:w="3120"/>
       </w:tblGrid>
       <w:tr>
-        <w:tblPrEx>
-          <w:tblCellMar>
-            <w:top w:w="0" w:type="dxa"/>
-            <w:bottom w:w="0" w:type="dxa"/>
-          </w:tblCellMar>
-        </w:tblPrEx>
         <w:tc>
           <w:tcPr>
             <w:tcW w:w="3120" w:type="dxa"/>
@@ -199,12 +193,6 @@
         <w:gridCol w:w="1260"/>
       </w:tblGrid>
       <w:tr>
-        <w:tblPrEx>
-          <w:tblCellMar>
-            <w:top w:w="0" w:type="dxa"/>
-            <w:bottom w:w="0" w:type="dxa"/>
-          </w:tblCellMar>
-        </w:tblPrEx>
         <w:trPr>
           <w:cantSplit/>
           <w:tblHeader/>
@@ -385,12 +373,6 @@
         </w:tc>
       </w:tr>
       <w:tr>
-        <w:tblPrEx>
-          <w:tblCellMar>
-            <w:top w:w="0" w:type="dxa"/>
-            <w:bottom w:w="0" w:type="dxa"/>
-          </w:tblCellMar>
-        </w:tblPrEx>
         <w:trPr>
           <w:cantSplit/>
         </w:trPr>
@@ -580,12 +562,6 @@
         </w:tc>
       </w:tr>
       <w:tr>
-        <w:tblPrEx>
-          <w:tblCellMar>
-            <w:top w:w="0" w:type="dxa"/>
-            <w:bottom w:w="0" w:type="dxa"/>
-          </w:tblCellMar>
-        </w:tblPrEx>
         <w:trPr>
           <w:cantSplit/>
         </w:trPr>
@@ -751,12 +727,6 @@
         </w:tc>
       </w:tr>
       <w:tr>
-        <w:tblPrEx>
-          <w:tblCellMar>
-            <w:top w:w="0" w:type="dxa"/>
-            <w:bottom w:w="0" w:type="dxa"/>
-          </w:tblCellMar>
-        </w:tblPrEx>
         <w:trPr>
           <w:cantSplit/>
         </w:trPr>
@@ -922,12 +892,6 @@
         </w:tc>
       </w:tr>
       <w:tr>
-        <w:tblPrEx>
-          <w:tblCellMar>
-            <w:top w:w="0" w:type="dxa"/>
-            <w:bottom w:w="0" w:type="dxa"/>
-          </w:tblCellMar>
-        </w:tblPrEx>
         <w:trPr>
           <w:cantSplit/>
         </w:trPr>
@@ -1093,12 +1057,6 @@
         </w:tc>
       </w:tr>
       <w:tr>
-        <w:tblPrEx>
-          <w:tblCellMar>
-            <w:top w:w="0" w:type="dxa"/>
-            <w:bottom w:w="0" w:type="dxa"/>
-          </w:tblCellMar>
-        </w:tblPrEx>
         <w:trPr>
           <w:cantSplit/>
         </w:trPr>
@@ -1264,12 +1222,6 @@
         </w:tc>
       </w:tr>
       <w:tr>
-        <w:tblPrEx>
-          <w:tblCellMar>
-            <w:top w:w="0" w:type="dxa"/>
-            <w:bottom w:w="0" w:type="dxa"/>
-          </w:tblCellMar>
-        </w:tblPrEx>
         <w:trPr>
           <w:cantSplit/>
         </w:trPr>
@@ -1435,12 +1387,6 @@
         </w:tc>
       </w:tr>
       <w:tr>
-        <w:tblPrEx>
-          <w:tblCellMar>
-            <w:top w:w="0" w:type="dxa"/>
-            <w:bottom w:w="0" w:type="dxa"/>
-          </w:tblCellMar>
-        </w:tblPrEx>
         <w:trPr>
           <w:cantSplit/>
         </w:trPr>
@@ -1606,12 +1552,6 @@
         </w:tc>
       </w:tr>
       <w:tr>
-        <w:tblPrEx>
-          <w:tblCellMar>
-            <w:top w:w="0" w:type="dxa"/>
-            <w:bottom w:w="0" w:type="dxa"/>
-          </w:tblCellMar>
-        </w:tblPrEx>
         <w:trPr>
           <w:cantSplit/>
         </w:trPr>
@@ -1777,12 +1717,6 @@
         </w:tc>
       </w:tr>
       <w:tr>
-        <w:tblPrEx>
-          <w:tblCellMar>
-            <w:top w:w="0" w:type="dxa"/>
-            <w:bottom w:w="0" w:type="dxa"/>
-          </w:tblCellMar>
-        </w:tblPrEx>
         <w:trPr>
           <w:cantSplit/>
         </w:trPr>
@@ -1948,12 +1882,6 @@
         </w:tc>
       </w:tr>
       <w:tr>
-        <w:tblPrEx>
-          <w:tblCellMar>
-            <w:top w:w="0" w:type="dxa"/>
-            <w:bottom w:w="0" w:type="dxa"/>
-          </w:tblCellMar>
-        </w:tblPrEx>
         <w:trPr>
           <w:cantSplit/>
         </w:trPr>
@@ -2143,12 +2071,6 @@
         </w:tc>
       </w:tr>
       <w:tr>
-        <w:tblPrEx>
-          <w:tblCellMar>
-            <w:top w:w="0" w:type="dxa"/>
-            <w:bottom w:w="0" w:type="dxa"/>
-          </w:tblCellMar>
-        </w:tblPrEx>
         <w:trPr>
           <w:cantSplit/>
         </w:trPr>
@@ -2314,12 +2236,6 @@
         </w:tc>
       </w:tr>
       <w:tr>
-        <w:tblPrEx>
-          <w:tblCellMar>
-            <w:top w:w="0" w:type="dxa"/>
-            <w:bottom w:w="0" w:type="dxa"/>
-          </w:tblCellMar>
-        </w:tblPrEx>
         <w:trPr>
           <w:cantSplit/>
         </w:trPr>
@@ -2526,12 +2442,6 @@
         </w:tc>
       </w:tr>
       <w:tr>
-        <w:tblPrEx>
-          <w:tblCellMar>
-            <w:top w:w="0" w:type="dxa"/>
-            <w:bottom w:w="0" w:type="dxa"/>
-          </w:tblCellMar>
-        </w:tblPrEx>
         <w:trPr>
           <w:cantSplit/>
         </w:trPr>
@@ -2717,12 +2627,6 @@
         </w:tc>
       </w:tr>
       <w:tr>
-        <w:tblPrEx>
-          <w:tblCellMar>
-            <w:top w:w="0" w:type="dxa"/>
-            <w:bottom w:w="0" w:type="dxa"/>
-          </w:tblCellMar>
-        </w:tblPrEx>
         <w:trPr>
           <w:cantSplit/>
         </w:trPr>
@@ -2950,28 +2854,27 @@
             <w:pPr>
               <w:spacing w:after="20"/>
               <w:rPr>
+                <w:lang w:val="en-US"/>
+              </w:rPr>
+            </w:pPr>
+            <w:r>
+              <w:rPr>
                 <w:rFonts w:hint="cs"/>
                 <w:lang w:val="en-US"/>
               </w:rPr>
-            </w:pPr>
+              <w:t xml:space="preserve">הפאקט יכלול גם אמות מידה לפי שנה </w:t>
+            </w:r>
+            <w:r>
+              <w:rPr>
+                <w:lang w:val="en-US"/>
+              </w:rPr>
+              <w:t>–</w:t>
+            </w:r>
             <w:r>
               <w:rPr>
                 <w:rFonts w:hint="cs"/>
                 <w:lang w:val="en-US"/>
               </w:rPr>
-              <w:t xml:space="preserve">הפאקט יכלול גם אמות מידה לפי שנה </w:t>
-            </w:r>
-            <w:r>
-              <w:rPr>
-                <w:lang w:val="en-US"/>
-              </w:rPr>
-              <w:t>–</w:t>
-            </w:r>
-            <w:r>
-              <w:rPr>
-                <w:rFonts w:hint="cs"/>
-                <w:lang w:val="en-US"/>
-              </w:rPr>
               <w:t xml:space="preserve"> שישאב מה</w:t>
             </w:r>
             <w:r>
@@ -2985,12 +2888,6 @@
         </w:tc>
       </w:tr>
       <w:tr>
-        <w:tblPrEx>
-          <w:tblCellMar>
-            <w:top w:w="0" w:type="dxa"/>
-            <w:bottom w:w="0" w:type="dxa"/>
-          </w:tblCellMar>
-        </w:tblPrEx>
         <w:trPr>
           <w:cantSplit/>
         </w:trPr>
@@ -3162,12 +3059,6 @@
         </w:tc>
       </w:tr>
       <w:tr>
-        <w:tblPrEx>
-          <w:tblCellMar>
-            <w:top w:w="0" w:type="dxa"/>
-            <w:bottom w:w="0" w:type="dxa"/>
-          </w:tblCellMar>
-        </w:tblPrEx>
         <w:trPr>
           <w:cantSplit/>
         </w:trPr>
@@ -3345,12 +3236,6 @@
         </w:tc>
       </w:tr>
       <w:tr>
-        <w:tblPrEx>
-          <w:tblCellMar>
-            <w:top w:w="0" w:type="dxa"/>
-            <w:bottom w:w="0" w:type="dxa"/>
-          </w:tblCellMar>
-        </w:tblPrEx>
         <w:trPr>
           <w:cantSplit/>
         </w:trPr>
@@ -3522,12 +3407,6 @@
         </w:tc>
       </w:tr>
       <w:tr>
-        <w:tblPrEx>
-          <w:tblCellMar>
-            <w:top w:w="0" w:type="dxa"/>
-            <w:bottom w:w="0" w:type="dxa"/>
-          </w:tblCellMar>
-        </w:tblPrEx>
         <w:trPr>
           <w:cantSplit/>
         </w:trPr>
@@ -3693,12 +3572,6 @@
         </w:tc>
       </w:tr>
       <w:tr>
-        <w:tblPrEx>
-          <w:tblCellMar>
-            <w:top w:w="0" w:type="dxa"/>
-            <w:bottom w:w="0" w:type="dxa"/>
-          </w:tblCellMar>
-        </w:tblPrEx>
         <w:trPr>
           <w:cantSplit/>
         </w:trPr>
@@ -3870,12 +3743,6 @@
         </w:tc>
       </w:tr>
       <w:tr>
-        <w:tblPrEx>
-          <w:tblCellMar>
-            <w:top w:w="0" w:type="dxa"/>
-            <w:bottom w:w="0" w:type="dxa"/>
-          </w:tblCellMar>
-        </w:tblPrEx>
         <w:trPr>
           <w:cantSplit/>
         </w:trPr>
@@ -4047,12 +3914,6 @@
         </w:tc>
       </w:tr>
       <w:tr>
-        <w:tblPrEx>
-          <w:tblCellMar>
-            <w:top w:w="0" w:type="dxa"/>
-            <w:bottom w:w="0" w:type="dxa"/>
-          </w:tblCellMar>
-        </w:tblPrEx>
         <w:trPr>
           <w:cantSplit/>
         </w:trPr>
@@ -4224,12 +4085,6 @@
         </w:tc>
       </w:tr>
       <w:tr>
-        <w:tblPrEx>
-          <w:tblCellMar>
-            <w:top w:w="0" w:type="dxa"/>
-            <w:bottom w:w="0" w:type="dxa"/>
-          </w:tblCellMar>
-        </w:tblPrEx>
         <w:trPr>
           <w:cantSplit/>
         </w:trPr>
@@ -4401,12 +4256,6 @@
         </w:tc>
       </w:tr>
       <w:tr>
-        <w:tblPrEx>
-          <w:tblCellMar>
-            <w:top w:w="0" w:type="dxa"/>
-            <w:bottom w:w="0" w:type="dxa"/>
-          </w:tblCellMar>
-        </w:tblPrEx>
         <w:trPr>
           <w:cantSplit/>
         </w:trPr>
@@ -4590,12 +4439,6 @@
         </w:tc>
       </w:tr>
       <w:tr>
-        <w:tblPrEx>
-          <w:tblCellMar>
-            <w:top w:w="0" w:type="dxa"/>
-            <w:bottom w:w="0" w:type="dxa"/>
-          </w:tblCellMar>
-        </w:tblPrEx>
         <w:trPr>
           <w:cantSplit/>
         </w:trPr>
@@ -4772,12 +4615,6 @@
         </w:tc>
       </w:tr>
       <w:tr>
-        <w:tblPrEx>
-          <w:tblCellMar>
-            <w:top w:w="0" w:type="dxa"/>
-            <w:bottom w:w="0" w:type="dxa"/>
-          </w:tblCellMar>
-        </w:tblPrEx>
         <w:trPr>
           <w:cantSplit/>
         </w:trPr>
@@ -4965,12 +4802,6 @@
         </w:tc>
       </w:tr>
       <w:tr>
-        <w:tblPrEx>
-          <w:tblCellMar>
-            <w:top w:w="0" w:type="dxa"/>
-            <w:bottom w:w="0" w:type="dxa"/>
-          </w:tblCellMar>
-        </w:tblPrEx>
         <w:trPr>
           <w:cantSplit/>
         </w:trPr>
@@ -5132,12 +4963,6 @@
         </w:tc>
       </w:tr>
       <w:tr>
-        <w:tblPrEx>
-          <w:tblCellMar>
-            <w:top w:w="0" w:type="dxa"/>
-            <w:bottom w:w="0" w:type="dxa"/>
-          </w:tblCellMar>
-        </w:tblPrEx>
         <w:trPr>
           <w:cantSplit/>
         </w:trPr>
@@ -5163,21 +4988,20 @@
               <w:spacing w:after="20"/>
               <w:jc w:val="center"/>
               <w:rPr>
+                <w:b/>
+                <w:bCs/>
+                <w:sz w:val="20"/>
+                <w:szCs w:val="20"/>
+              </w:rPr>
+            </w:pPr>
+            <w:r>
+              <w:rPr>
                 <w:rFonts w:hint="cs"/>
                 <w:b/>
                 <w:bCs/>
                 <w:sz w:val="20"/>
                 <w:szCs w:val="20"/>
               </w:rPr>
-            </w:pPr>
-            <w:r>
-              <w:rPr>
-                <w:rFonts w:hint="cs"/>
-                <w:b/>
-                <w:bCs/>
-                <w:sz w:val="20"/>
-                <w:szCs w:val="20"/>
-              </w:rPr>
               <w:t>27</w:t>
             </w:r>
           </w:p>
@@ -5203,7 +5027,6 @@
             <w:pPr>
               <w:spacing w:after="20"/>
               <w:rPr>
-                <w:rFonts w:hint="cs"/>
                 <w:sz w:val="20"/>
                 <w:szCs w:val="20"/>
               </w:rPr>
@@ -5316,12 +5139,6 @@
         </w:tc>
       </w:tr>
       <w:tr>
-        <w:tblPrEx>
-          <w:tblCellMar>
-            <w:top w:w="0" w:type="dxa"/>
-            <w:bottom w:w="0" w:type="dxa"/>
-          </w:tblCellMar>
-        </w:tblPrEx>
         <w:trPr>
           <w:cantSplit/>
         </w:trPr>
@@ -5347,7 +5164,6 @@
               <w:spacing w:after="20"/>
               <w:jc w:val="center"/>
               <w:rPr>
-                <w:rFonts w:hint="cs"/>
                 <w:b/>
                 <w:bCs/>
                 <w:sz w:val="20"/>
@@ -5388,7 +5204,6 @@
             <w:pPr>
               <w:spacing w:after="20"/>
               <w:rPr>
-                <w:rFonts w:hint="cs"/>
                 <w:sz w:val="20"/>
                 <w:szCs w:val="20"/>
               </w:rPr>
@@ -5506,1335 +5321,6 @@
         <w:pStyle w:val="Heading2"/>
         <w:spacing w:before="300" w:after="140"/>
       </w:pPr>
-      <w:r>
-        <w:rPr>
-          <w:color w:val="1F3F6D"/>
-        </w:rPr>
-        <w:t>דשבורד הישגיות</w:t>
-      </w:r>
-    </w:p>
-    <w:tbl>
-      <w:tblPr>
-        <w:bidiVisual/>
-        <w:tblW w:w="9360" w:type="dxa"/>
-        <w:tblBorders>
-          <w:top w:val="single" w:sz="4" w:space="0" w:color="auto"/>
-          <w:left w:val="single" w:sz="4" w:space="0" w:color="auto"/>
-          <w:bottom w:val="single" w:sz="4" w:space="0" w:color="auto"/>
-          <w:right w:val="single" w:sz="4" w:space="0" w:color="auto"/>
-          <w:insideH w:val="single" w:sz="4" w:space="0" w:color="auto"/>
-          <w:insideV w:val="single" w:sz="4" w:space="0" w:color="auto"/>
-        </w:tblBorders>
-        <w:tblCellMar>
-          <w:left w:w="10" w:type="dxa"/>
-          <w:right w:w="10" w:type="dxa"/>
-        </w:tblCellMar>
-        <w:tblLook w:val="0000" w:firstRow="0" w:lastRow="0" w:firstColumn="0" w:lastColumn="0" w:noHBand="0" w:noVBand="0"/>
-      </w:tblPr>
-      <w:tblGrid>
-        <w:gridCol w:w="560"/>
-        <w:gridCol w:w="3680"/>
-        <w:gridCol w:w="1240"/>
-        <w:gridCol w:w="2620"/>
-        <w:gridCol w:w="1260"/>
-      </w:tblGrid>
-      <w:tr>
-        <w:tblPrEx>
-          <w:tblCellMar>
-            <w:top w:w="0" w:type="dxa"/>
-            <w:bottom w:w="0" w:type="dxa"/>
-          </w:tblCellMar>
-        </w:tblPrEx>
-        <w:trPr>
-          <w:cantSplit/>
-          <w:tblHeader/>
-        </w:trPr>
-        <w:tc>
-          <w:tcPr>
-            <w:tcW w:w="560" w:type="dxa"/>
-            <w:tcBorders>
-              <w:top w:val="single" w:sz="4" w:space="0" w:color="C9D2DE"/>
-              <w:left w:val="single" w:sz="4" w:space="0" w:color="C9D2DE"/>
-              <w:bottom w:val="single" w:sz="4" w:space="0" w:color="C9D2DE"/>
-              <w:right w:val="single" w:sz="4" w:space="0" w:color="C9D2DE"/>
-            </w:tcBorders>
-            <w:shd w:val="clear" w:color="auto" w:fill="1F3F6D"/>
-            <w:tcMar>
-              <w:top w:w="70" w:type="dxa"/>
-              <w:left w:w="110" w:type="dxa"/>
-              <w:bottom w:w="70" w:type="dxa"/>
-              <w:right w:w="110" w:type="dxa"/>
-            </w:tcMar>
-            <w:vAlign w:val="center"/>
-          </w:tcPr>
-          <w:p>
-            <w:pPr>
-              <w:spacing w:after="20"/>
-              <w:jc w:val="center"/>
-            </w:pPr>
-            <w:r>
-              <w:rPr>
-                <w:b/>
-                <w:bCs/>
-                <w:color w:val="FFFFFF"/>
-                <w:sz w:val="20"/>
-                <w:szCs w:val="20"/>
-              </w:rPr>
-              <w:t>מס׳</w:t>
-            </w:r>
-          </w:p>
-        </w:tc>
-        <w:tc>
-          <w:tcPr>
-            <w:tcW w:w="3680" w:type="dxa"/>
-            <w:tcBorders>
-              <w:top w:val="single" w:sz="4" w:space="0" w:color="C9D2DE"/>
-              <w:left w:val="single" w:sz="4" w:space="0" w:color="C9D2DE"/>
-              <w:bottom w:val="single" w:sz="4" w:space="0" w:color="C9D2DE"/>
-              <w:right w:val="single" w:sz="4" w:space="0" w:color="C9D2DE"/>
-            </w:tcBorders>
-            <w:shd w:val="clear" w:color="auto" w:fill="1F3F6D"/>
-            <w:tcMar>
-              <w:top w:w="70" w:type="dxa"/>
-              <w:left w:w="110" w:type="dxa"/>
-              <w:bottom w:w="70" w:type="dxa"/>
-              <w:right w:w="110" w:type="dxa"/>
-            </w:tcMar>
-            <w:vAlign w:val="center"/>
-          </w:tcPr>
-          <w:p>
-            <w:pPr>
-              <w:spacing w:after="20"/>
-            </w:pPr>
-            <w:r>
-              <w:rPr>
-                <w:b/>
-                <w:bCs/>
-                <w:color w:val="FFFFFF"/>
-                <w:sz w:val="20"/>
-                <w:szCs w:val="20"/>
-              </w:rPr>
-              <w:t>המשימה</w:t>
-            </w:r>
-          </w:p>
-        </w:tc>
-        <w:tc>
-          <w:tcPr>
-            <w:tcW w:w="1240" w:type="dxa"/>
-            <w:tcBorders>
-              <w:top w:val="single" w:sz="4" w:space="0" w:color="C9D2DE"/>
-              <w:left w:val="single" w:sz="4" w:space="0" w:color="C9D2DE"/>
-              <w:bottom w:val="single" w:sz="4" w:space="0" w:color="C9D2DE"/>
-              <w:right w:val="single" w:sz="4" w:space="0" w:color="C9D2DE"/>
-            </w:tcBorders>
-            <w:shd w:val="clear" w:color="auto" w:fill="1F3F6D"/>
-            <w:tcMar>
-              <w:top w:w="70" w:type="dxa"/>
-              <w:left w:w="110" w:type="dxa"/>
-              <w:bottom w:w="70" w:type="dxa"/>
-              <w:right w:w="110" w:type="dxa"/>
-            </w:tcMar>
-            <w:vAlign w:val="center"/>
-          </w:tcPr>
-          <w:p>
-            <w:pPr>
-              <w:spacing w:after="20"/>
-              <w:jc w:val="center"/>
-            </w:pPr>
-            <w:r>
-              <w:rPr>
-                <w:b/>
-                <w:bCs/>
-                <w:color w:val="FFFFFF"/>
-                <w:sz w:val="20"/>
-                <w:szCs w:val="20"/>
-              </w:rPr>
-              <w:t>סיווג</w:t>
-            </w:r>
-          </w:p>
-        </w:tc>
-        <w:tc>
-          <w:tcPr>
-            <w:tcW w:w="2620" w:type="dxa"/>
-            <w:tcBorders>
-              <w:top w:val="single" w:sz="4" w:space="0" w:color="C9D2DE"/>
-              <w:left w:val="single" w:sz="4" w:space="0" w:color="C9D2DE"/>
-              <w:bottom w:val="single" w:sz="4" w:space="0" w:color="C9D2DE"/>
-              <w:right w:val="single" w:sz="4" w:space="0" w:color="C9D2DE"/>
-            </w:tcBorders>
-            <w:shd w:val="clear" w:color="auto" w:fill="1F3F6D"/>
-            <w:tcMar>
-              <w:top w:w="70" w:type="dxa"/>
-              <w:left w:w="110" w:type="dxa"/>
-              <w:bottom w:w="70" w:type="dxa"/>
-              <w:right w:w="110" w:type="dxa"/>
-            </w:tcMar>
-            <w:vAlign w:val="center"/>
-          </w:tcPr>
-          <w:p>
-            <w:pPr>
-              <w:spacing w:after="20"/>
-              <w:jc w:val="center"/>
-            </w:pPr>
-            <w:r>
-              <w:rPr>
-                <w:b/>
-                <w:bCs/>
-                <w:color w:val="FFFFFF"/>
-                <w:sz w:val="20"/>
-                <w:szCs w:val="20"/>
-              </w:rPr>
-              <w:t>התרשים הרלוונטי</w:t>
-            </w:r>
-          </w:p>
-        </w:tc>
-        <w:tc>
-          <w:tcPr>
-            <w:tcW w:w="1260" w:type="dxa"/>
-            <w:tcBorders>
-              <w:top w:val="single" w:sz="4" w:space="0" w:color="C9D2DE"/>
-              <w:left w:val="single" w:sz="4" w:space="0" w:color="C9D2DE"/>
-              <w:bottom w:val="single" w:sz="4" w:space="0" w:color="C9D2DE"/>
-              <w:right w:val="single" w:sz="4" w:space="0" w:color="C9D2DE"/>
-            </w:tcBorders>
-            <w:shd w:val="clear" w:color="auto" w:fill="1F3F6D"/>
-            <w:tcMar>
-              <w:top w:w="70" w:type="dxa"/>
-              <w:left w:w="110" w:type="dxa"/>
-              <w:bottom w:w="70" w:type="dxa"/>
-              <w:right w:w="110" w:type="dxa"/>
-            </w:tcMar>
-            <w:vAlign w:val="center"/>
-          </w:tcPr>
-          <w:p>
-            <w:pPr>
-              <w:spacing w:after="20"/>
-              <w:jc w:val="center"/>
-            </w:pPr>
-            <w:r>
-              <w:rPr>
-                <w:b/>
-                <w:bCs/>
-                <w:color w:val="FFFFFF"/>
-                <w:sz w:val="20"/>
-                <w:szCs w:val="20"/>
-              </w:rPr>
-              <w:t>החלטה בפגישה</w:t>
-            </w:r>
-          </w:p>
-        </w:tc>
-      </w:tr>
-      <w:tr>
-        <w:tblPrEx>
-          <w:tblCellMar>
-            <w:top w:w="0" w:type="dxa"/>
-            <w:bottom w:w="0" w:type="dxa"/>
-          </w:tblCellMar>
-        </w:tblPrEx>
-        <w:trPr>
-          <w:cantSplit/>
-        </w:trPr>
-        <w:tc>
-          <w:tcPr>
-            <w:tcW w:w="560" w:type="dxa"/>
-            <w:tcBorders>
-              <w:top w:val="single" w:sz="4" w:space="0" w:color="C9D2DE"/>
-              <w:left w:val="single" w:sz="4" w:space="0" w:color="C9D2DE"/>
-              <w:bottom w:val="single" w:sz="4" w:space="0" w:color="C9D2DE"/>
-              <w:right w:val="single" w:sz="4" w:space="0" w:color="C9D2DE"/>
-            </w:tcBorders>
-            <w:tcMar>
-              <w:top w:w="70" w:type="dxa"/>
-              <w:left w:w="110" w:type="dxa"/>
-              <w:bottom w:w="70" w:type="dxa"/>
-              <w:right w:w="110" w:type="dxa"/>
-            </w:tcMar>
-            <w:vAlign w:val="center"/>
-          </w:tcPr>
-          <w:p>
-            <w:pPr>
-              <w:spacing w:after="20"/>
-              <w:jc w:val="center"/>
-            </w:pPr>
-            <w:r>
-              <w:rPr>
-                <w:b/>
-                <w:bCs/>
-                <w:sz w:val="20"/>
-                <w:szCs w:val="20"/>
-              </w:rPr>
-              <w:t>1</w:t>
-            </w:r>
-          </w:p>
-        </w:tc>
-        <w:tc>
-          <w:tcPr>
-            <w:tcW w:w="3680" w:type="dxa"/>
-            <w:tcBorders>
-              <w:top w:val="single" w:sz="4" w:space="0" w:color="C9D2DE"/>
-              <w:left w:val="single" w:sz="4" w:space="0" w:color="C9D2DE"/>
-              <w:bottom w:val="single" w:sz="4" w:space="0" w:color="C9D2DE"/>
-              <w:right w:val="single" w:sz="4" w:space="0" w:color="C9D2DE"/>
-            </w:tcBorders>
-            <w:tcMar>
-              <w:top w:w="70" w:type="dxa"/>
-              <w:left w:w="110" w:type="dxa"/>
-              <w:bottom w:w="70" w:type="dxa"/>
-              <w:right w:w="110" w:type="dxa"/>
-            </w:tcMar>
-            <w:vAlign w:val="center"/>
-          </w:tcPr>
-          <w:p>
-            <w:pPr>
-              <w:spacing w:after="20"/>
-            </w:pPr>
-            <w:r>
-              <w:rPr>
-                <w:sz w:val="20"/>
-                <w:szCs w:val="20"/>
-              </w:rPr>
-              <w:t>טבלת זוכים: להוריד עמודת "מדליה" (כפילות עם עמודת "מיקום")</w:t>
-            </w:r>
-          </w:p>
-        </w:tc>
-        <w:tc>
-          <w:tcPr>
-            <w:tcW w:w="1240" w:type="dxa"/>
-            <w:tcBorders>
-              <w:top w:val="single" w:sz="4" w:space="0" w:color="C9D2DE"/>
-              <w:left w:val="single" w:sz="4" w:space="0" w:color="C9D2DE"/>
-              <w:bottom w:val="single" w:sz="4" w:space="0" w:color="C9D2DE"/>
-              <w:right w:val="single" w:sz="4" w:space="0" w:color="C9D2DE"/>
-            </w:tcBorders>
-            <w:shd w:val="clear" w:color="auto" w:fill="DCEFE1"/>
-            <w:tcMar>
-              <w:top w:w="70" w:type="dxa"/>
-              <w:left w:w="110" w:type="dxa"/>
-              <w:bottom w:w="70" w:type="dxa"/>
-              <w:right w:w="110" w:type="dxa"/>
-            </w:tcMar>
-            <w:vAlign w:val="center"/>
-          </w:tcPr>
-          <w:p>
-            <w:pPr>
-              <w:spacing w:after="20"/>
-              <w:jc w:val="center"/>
-            </w:pPr>
-            <w:r>
-              <w:rPr>
-                <w:b/>
-                <w:bCs/>
-                <w:sz w:val="20"/>
-                <w:szCs w:val="20"/>
-              </w:rPr>
-              <w:t>תיקון ברור</w:t>
-            </w:r>
-          </w:p>
-        </w:tc>
-        <w:tc>
-          <w:tcPr>
-            <w:tcW w:w="2620" w:type="dxa"/>
-            <w:tcBorders>
-              <w:top w:val="single" w:sz="4" w:space="0" w:color="C9D2DE"/>
-              <w:left w:val="single" w:sz="4" w:space="0" w:color="C9D2DE"/>
-              <w:bottom w:val="single" w:sz="4" w:space="0" w:color="C9D2DE"/>
-              <w:right w:val="single" w:sz="4" w:space="0" w:color="C9D2DE"/>
-            </w:tcBorders>
-            <w:tcMar>
-              <w:top w:w="70" w:type="dxa"/>
-              <w:left w:w="110" w:type="dxa"/>
-              <w:bottom w:w="70" w:type="dxa"/>
-              <w:right w:w="110" w:type="dxa"/>
-            </w:tcMar>
-            <w:vAlign w:val="center"/>
-          </w:tcPr>
-          <w:p>
-            <w:pPr>
-              <w:spacing w:after="10"/>
-            </w:pPr>
-            <w:r>
-              <w:rPr>
-                <w:sz w:val="18"/>
-                <w:szCs w:val="18"/>
-              </w:rPr>
-              <w:t>• טבלת זוכים</w:t>
-            </w:r>
-          </w:p>
-          <w:p>
-            <w:r>
-              <w:rPr>
-                <w:color w:val="9AA4B2"/>
-                <w:sz w:val="14"/>
-                <w:szCs w:val="14"/>
-              </w:rPr>
-              <w:t>c_medals</w:t>
-            </w:r>
-          </w:p>
-        </w:tc>
-        <w:tc>
-          <w:tcPr>
-            <w:tcW w:w="1260" w:type="dxa"/>
-            <w:tcBorders>
-              <w:top w:val="single" w:sz="4" w:space="0" w:color="C9D2DE"/>
-              <w:left w:val="single" w:sz="4" w:space="0" w:color="C9D2DE"/>
-              <w:bottom w:val="single" w:sz="4" w:space="0" w:color="C9D2DE"/>
-              <w:right w:val="single" w:sz="4" w:space="0" w:color="C9D2DE"/>
-            </w:tcBorders>
-            <w:tcMar>
-              <w:top w:w="70" w:type="dxa"/>
-              <w:left w:w="110" w:type="dxa"/>
-              <w:bottom w:w="70" w:type="dxa"/>
-              <w:right w:w="110" w:type="dxa"/>
-            </w:tcMar>
-            <w:vAlign w:val="center"/>
-          </w:tcPr>
-          <w:p>
-            <w:pPr>
-              <w:spacing w:after="20"/>
-            </w:pPr>
-          </w:p>
-        </w:tc>
-      </w:tr>
-      <w:tr>
-        <w:tblPrEx>
-          <w:tblCellMar>
-            <w:top w:w="0" w:type="dxa"/>
-            <w:bottom w:w="0" w:type="dxa"/>
-          </w:tblCellMar>
-        </w:tblPrEx>
-        <w:trPr>
-          <w:cantSplit/>
-        </w:trPr>
-        <w:tc>
-          <w:tcPr>
-            <w:tcW w:w="560" w:type="dxa"/>
-            <w:tcBorders>
-              <w:top w:val="single" w:sz="4" w:space="0" w:color="C9D2DE"/>
-              <w:left w:val="single" w:sz="4" w:space="0" w:color="C9D2DE"/>
-              <w:bottom w:val="single" w:sz="4" w:space="0" w:color="C9D2DE"/>
-              <w:right w:val="single" w:sz="4" w:space="0" w:color="C9D2DE"/>
-            </w:tcBorders>
-            <w:tcMar>
-              <w:top w:w="70" w:type="dxa"/>
-              <w:left w:w="110" w:type="dxa"/>
-              <w:bottom w:w="70" w:type="dxa"/>
-              <w:right w:w="110" w:type="dxa"/>
-            </w:tcMar>
-            <w:vAlign w:val="center"/>
-          </w:tcPr>
-          <w:p>
-            <w:pPr>
-              <w:spacing w:after="20"/>
-              <w:jc w:val="center"/>
-            </w:pPr>
-            <w:r>
-              <w:rPr>
-                <w:b/>
-                <w:bCs/>
-                <w:sz w:val="20"/>
-                <w:szCs w:val="20"/>
-              </w:rPr>
-              <w:t>2</w:t>
-            </w:r>
-          </w:p>
-        </w:tc>
-        <w:tc>
-          <w:tcPr>
-            <w:tcW w:w="3680" w:type="dxa"/>
-            <w:tcBorders>
-              <w:top w:val="single" w:sz="4" w:space="0" w:color="C9D2DE"/>
-              <w:left w:val="single" w:sz="4" w:space="0" w:color="C9D2DE"/>
-              <w:bottom w:val="single" w:sz="4" w:space="0" w:color="C9D2DE"/>
-              <w:right w:val="single" w:sz="4" w:space="0" w:color="C9D2DE"/>
-            </w:tcBorders>
-            <w:tcMar>
-              <w:top w:w="70" w:type="dxa"/>
-              <w:left w:w="110" w:type="dxa"/>
-              <w:bottom w:w="70" w:type="dxa"/>
-              <w:right w:w="110" w:type="dxa"/>
-            </w:tcMar>
-            <w:vAlign w:val="center"/>
-          </w:tcPr>
-          <w:p>
-            <w:pPr>
-              <w:spacing w:after="20"/>
-            </w:pPr>
-            <w:r>
-              <w:rPr>
-                <w:sz w:val="20"/>
-                <w:szCs w:val="20"/>
-              </w:rPr>
-              <w:t>סינון שכבות גיל לא תקין: ההבחנה "שכבת גיל" מול "שכבת גיל תחרות" לא ברורה;</w:t>
-            </w:r>
-          </w:p>
-          <w:p>
-            <w:pPr>
-              <w:spacing w:after="20"/>
-            </w:pPr>
-            <w:r>
-              <w:rPr>
-                <w:sz w:val="20"/>
-                <w:szCs w:val="20"/>
-              </w:rPr>
-              <w:t>ליישר ערכי שכבות הגיל לאלה שבדשבורד ספורטאים;</w:t>
-            </w:r>
-          </w:p>
-          <w:p>
-            <w:pPr>
-              <w:spacing w:after="20"/>
-            </w:pPr>
-            <w:r>
-              <w:rPr>
-                <w:sz w:val="20"/>
-                <w:szCs w:val="20"/>
-              </w:rPr>
-              <w:t>"סף מספר מדינות" (‏5+‏/‏12+‏) ו"סה"כ משתתפים" אינם מובנים/הגיוניים</w:t>
-            </w:r>
-          </w:p>
-        </w:tc>
-        <w:tc>
-          <w:tcPr>
-            <w:tcW w:w="1240" w:type="dxa"/>
-            <w:tcBorders>
-              <w:top w:val="single" w:sz="4" w:space="0" w:color="C9D2DE"/>
-              <w:left w:val="single" w:sz="4" w:space="0" w:color="C9D2DE"/>
-              <w:bottom w:val="single" w:sz="4" w:space="0" w:color="C9D2DE"/>
-              <w:right w:val="single" w:sz="4" w:space="0" w:color="C9D2DE"/>
-            </w:tcBorders>
-            <w:shd w:val="clear" w:color="auto" w:fill="FBEFC4"/>
-            <w:tcMar>
-              <w:top w:w="70" w:type="dxa"/>
-              <w:left w:w="110" w:type="dxa"/>
-              <w:bottom w:w="70" w:type="dxa"/>
-              <w:right w:w="110" w:type="dxa"/>
-            </w:tcMar>
-            <w:vAlign w:val="center"/>
-          </w:tcPr>
-          <w:p>
-            <w:pPr>
-              <w:spacing w:after="20"/>
-              <w:jc w:val="center"/>
-            </w:pPr>
-            <w:r>
-              <w:rPr>
-                <w:b/>
-                <w:bCs/>
-                <w:sz w:val="20"/>
-                <w:szCs w:val="20"/>
-              </w:rPr>
-              <w:t>דורש דיון</w:t>
-            </w:r>
-          </w:p>
-        </w:tc>
-        <w:tc>
-          <w:tcPr>
-            <w:tcW w:w="2620" w:type="dxa"/>
-            <w:tcBorders>
-              <w:top w:val="single" w:sz="4" w:space="0" w:color="C9D2DE"/>
-              <w:left w:val="single" w:sz="4" w:space="0" w:color="C9D2DE"/>
-              <w:bottom w:val="single" w:sz="4" w:space="0" w:color="C9D2DE"/>
-              <w:right w:val="single" w:sz="4" w:space="0" w:color="C9D2DE"/>
-            </w:tcBorders>
-            <w:tcMar>
-              <w:top w:w="70" w:type="dxa"/>
-              <w:left w:w="110" w:type="dxa"/>
-              <w:bottom w:w="70" w:type="dxa"/>
-              <w:right w:w="110" w:type="dxa"/>
-            </w:tcMar>
-            <w:vAlign w:val="center"/>
-          </w:tcPr>
-          <w:p>
-            <w:pPr>
-              <w:spacing w:after="10"/>
-            </w:pPr>
-            <w:r>
-              <w:rPr>
-                <w:sz w:val="18"/>
-                <w:szCs w:val="18"/>
-              </w:rPr>
-              <w:t>• ניקוד לפי ענף</w:t>
-            </w:r>
-          </w:p>
-          <w:p>
-            <w:r>
-              <w:rPr>
-                <w:color w:val="9AA4B2"/>
-                <w:sz w:val="14"/>
-                <w:szCs w:val="14"/>
-              </w:rPr>
-              <w:t>c_branch</w:t>
-            </w:r>
-          </w:p>
-        </w:tc>
-        <w:tc>
-          <w:tcPr>
-            <w:tcW w:w="1260" w:type="dxa"/>
-            <w:tcBorders>
-              <w:top w:val="single" w:sz="4" w:space="0" w:color="C9D2DE"/>
-              <w:left w:val="single" w:sz="4" w:space="0" w:color="C9D2DE"/>
-              <w:bottom w:val="single" w:sz="4" w:space="0" w:color="C9D2DE"/>
-              <w:right w:val="single" w:sz="4" w:space="0" w:color="C9D2DE"/>
-            </w:tcBorders>
-            <w:tcMar>
-              <w:top w:w="70" w:type="dxa"/>
-              <w:left w:w="110" w:type="dxa"/>
-              <w:bottom w:w="70" w:type="dxa"/>
-              <w:right w:w="110" w:type="dxa"/>
-            </w:tcMar>
-            <w:vAlign w:val="center"/>
-          </w:tcPr>
-          <w:p>
-            <w:pPr>
-              <w:spacing w:after="20"/>
-            </w:pPr>
-          </w:p>
-        </w:tc>
-      </w:tr>
-      <w:tr>
-        <w:tblPrEx>
-          <w:tblCellMar>
-            <w:top w:w="0" w:type="dxa"/>
-            <w:bottom w:w="0" w:type="dxa"/>
-          </w:tblCellMar>
-        </w:tblPrEx>
-        <w:trPr>
-          <w:cantSplit/>
-        </w:trPr>
-        <w:tc>
-          <w:tcPr>
-            <w:tcW w:w="560" w:type="dxa"/>
-            <w:tcBorders>
-              <w:top w:val="single" w:sz="4" w:space="0" w:color="C9D2DE"/>
-              <w:left w:val="single" w:sz="4" w:space="0" w:color="C9D2DE"/>
-              <w:bottom w:val="single" w:sz="4" w:space="0" w:color="C9D2DE"/>
-              <w:right w:val="single" w:sz="4" w:space="0" w:color="C9D2DE"/>
-            </w:tcBorders>
-            <w:tcMar>
-              <w:top w:w="70" w:type="dxa"/>
-              <w:left w:w="110" w:type="dxa"/>
-              <w:bottom w:w="70" w:type="dxa"/>
-              <w:right w:w="110" w:type="dxa"/>
-            </w:tcMar>
-            <w:vAlign w:val="center"/>
-          </w:tcPr>
-          <w:p>
-            <w:pPr>
-              <w:spacing w:after="20"/>
-              <w:jc w:val="center"/>
-            </w:pPr>
-            <w:r>
-              <w:rPr>
-                <w:b/>
-                <w:bCs/>
-                <w:sz w:val="20"/>
-                <w:szCs w:val="20"/>
-              </w:rPr>
-              <w:t>3</w:t>
-            </w:r>
-          </w:p>
-        </w:tc>
-        <w:tc>
-          <w:tcPr>
-            <w:tcW w:w="3680" w:type="dxa"/>
-            <w:tcBorders>
-              <w:top w:val="single" w:sz="4" w:space="0" w:color="C9D2DE"/>
-              <w:left w:val="single" w:sz="4" w:space="0" w:color="C9D2DE"/>
-              <w:bottom w:val="single" w:sz="4" w:space="0" w:color="C9D2DE"/>
-              <w:right w:val="single" w:sz="4" w:space="0" w:color="C9D2DE"/>
-            </w:tcBorders>
-            <w:tcMar>
-              <w:top w:w="70" w:type="dxa"/>
-              <w:left w:w="110" w:type="dxa"/>
-              <w:bottom w:w="70" w:type="dxa"/>
-              <w:right w:w="110" w:type="dxa"/>
-            </w:tcMar>
-            <w:vAlign w:val="center"/>
-          </w:tcPr>
-          <w:p>
-            <w:pPr>
-              <w:spacing w:after="20"/>
-            </w:pPr>
-            <w:r>
-              <w:rPr>
-                <w:sz w:val="20"/>
-                <w:szCs w:val="20"/>
-              </w:rPr>
-              <w:t>גיל ומגדר: להגדיר מבנה שכבות (קדטים / נערים / מתחת 23 / בוגרים) עם עמודה נפרדת לנשים ולגברים; ולהגדיר מהי "התפלגות לפי סוג תחרות" (= ניקוד הישגיות?)</w:t>
-            </w:r>
-          </w:p>
-        </w:tc>
-        <w:tc>
-          <w:tcPr>
-            <w:tcW w:w="1240" w:type="dxa"/>
-            <w:tcBorders>
-              <w:top w:val="single" w:sz="4" w:space="0" w:color="C9D2DE"/>
-              <w:left w:val="single" w:sz="4" w:space="0" w:color="C9D2DE"/>
-              <w:bottom w:val="single" w:sz="4" w:space="0" w:color="C9D2DE"/>
-              <w:right w:val="single" w:sz="4" w:space="0" w:color="C9D2DE"/>
-            </w:tcBorders>
-            <w:shd w:val="clear" w:color="auto" w:fill="FBEFC4"/>
-            <w:tcMar>
-              <w:top w:w="70" w:type="dxa"/>
-              <w:left w:w="110" w:type="dxa"/>
-              <w:bottom w:w="70" w:type="dxa"/>
-              <w:right w:w="110" w:type="dxa"/>
-            </w:tcMar>
-            <w:vAlign w:val="center"/>
-          </w:tcPr>
-          <w:p>
-            <w:pPr>
-              <w:spacing w:after="20"/>
-              <w:jc w:val="center"/>
-            </w:pPr>
-            <w:r>
-              <w:rPr>
-                <w:b/>
-                <w:bCs/>
-                <w:sz w:val="20"/>
-                <w:szCs w:val="20"/>
-              </w:rPr>
-              <w:t>דורש דיון</w:t>
-            </w:r>
-          </w:p>
-        </w:tc>
-        <w:tc>
-          <w:tcPr>
-            <w:tcW w:w="2620" w:type="dxa"/>
-            <w:tcBorders>
-              <w:top w:val="single" w:sz="4" w:space="0" w:color="C9D2DE"/>
-              <w:left w:val="single" w:sz="4" w:space="0" w:color="C9D2DE"/>
-              <w:bottom w:val="single" w:sz="4" w:space="0" w:color="C9D2DE"/>
-              <w:right w:val="single" w:sz="4" w:space="0" w:color="C9D2DE"/>
-            </w:tcBorders>
-            <w:tcMar>
-              <w:top w:w="70" w:type="dxa"/>
-              <w:left w:w="110" w:type="dxa"/>
-              <w:bottom w:w="70" w:type="dxa"/>
-              <w:right w:w="110" w:type="dxa"/>
-            </w:tcMar>
-            <w:vAlign w:val="center"/>
-          </w:tcPr>
-          <w:p>
-            <w:pPr>
-              <w:spacing w:after="10"/>
-            </w:pPr>
-            <w:r>
-              <w:rPr>
-                <w:sz w:val="18"/>
-                <w:szCs w:val="18"/>
-              </w:rPr>
-              <w:t>• גיל ומגדר</w:t>
-            </w:r>
-          </w:p>
-          <w:p>
-            <w:r>
-              <w:rPr>
-                <w:color w:val="9AA4B2"/>
-                <w:sz w:val="14"/>
-                <w:szCs w:val="14"/>
-              </w:rPr>
-              <w:t>c_age</w:t>
-            </w:r>
-          </w:p>
-        </w:tc>
-        <w:tc>
-          <w:tcPr>
-            <w:tcW w:w="1260" w:type="dxa"/>
-            <w:tcBorders>
-              <w:top w:val="single" w:sz="4" w:space="0" w:color="C9D2DE"/>
-              <w:left w:val="single" w:sz="4" w:space="0" w:color="C9D2DE"/>
-              <w:bottom w:val="single" w:sz="4" w:space="0" w:color="C9D2DE"/>
-              <w:right w:val="single" w:sz="4" w:space="0" w:color="C9D2DE"/>
-            </w:tcBorders>
-            <w:tcMar>
-              <w:top w:w="70" w:type="dxa"/>
-              <w:left w:w="110" w:type="dxa"/>
-              <w:bottom w:w="70" w:type="dxa"/>
-              <w:right w:w="110" w:type="dxa"/>
-            </w:tcMar>
-            <w:vAlign w:val="center"/>
-          </w:tcPr>
-          <w:p>
-            <w:pPr>
-              <w:spacing w:after="20"/>
-            </w:pPr>
-          </w:p>
-        </w:tc>
-      </w:tr>
-      <w:tr>
-        <w:tblPrEx>
-          <w:tblCellMar>
-            <w:top w:w="0" w:type="dxa"/>
-            <w:bottom w:w="0" w:type="dxa"/>
-          </w:tblCellMar>
-        </w:tblPrEx>
-        <w:trPr>
-          <w:cantSplit/>
-        </w:trPr>
-        <w:tc>
-          <w:tcPr>
-            <w:tcW w:w="560" w:type="dxa"/>
-            <w:tcBorders>
-              <w:top w:val="single" w:sz="4" w:space="0" w:color="C9D2DE"/>
-              <w:left w:val="single" w:sz="4" w:space="0" w:color="C9D2DE"/>
-              <w:bottom w:val="single" w:sz="4" w:space="0" w:color="C9D2DE"/>
-              <w:right w:val="single" w:sz="4" w:space="0" w:color="C9D2DE"/>
-            </w:tcBorders>
-            <w:tcMar>
-              <w:top w:w="70" w:type="dxa"/>
-              <w:left w:w="110" w:type="dxa"/>
-              <w:bottom w:w="70" w:type="dxa"/>
-              <w:right w:w="110" w:type="dxa"/>
-            </w:tcMar>
-            <w:vAlign w:val="center"/>
-          </w:tcPr>
-          <w:p>
-            <w:pPr>
-              <w:spacing w:after="20"/>
-              <w:jc w:val="center"/>
-            </w:pPr>
-            <w:r>
-              <w:rPr>
-                <w:b/>
-                <w:bCs/>
-                <w:sz w:val="20"/>
-                <w:szCs w:val="20"/>
-              </w:rPr>
-              <w:t>4</w:t>
-            </w:r>
-          </w:p>
-        </w:tc>
-        <w:tc>
-          <w:tcPr>
-            <w:tcW w:w="3680" w:type="dxa"/>
-            <w:tcBorders>
-              <w:top w:val="single" w:sz="4" w:space="0" w:color="C9D2DE"/>
-              <w:left w:val="single" w:sz="4" w:space="0" w:color="C9D2DE"/>
-              <w:bottom w:val="single" w:sz="4" w:space="0" w:color="C9D2DE"/>
-              <w:right w:val="single" w:sz="4" w:space="0" w:color="C9D2DE"/>
-            </w:tcBorders>
-            <w:tcMar>
-              <w:top w:w="70" w:type="dxa"/>
-              <w:left w:w="110" w:type="dxa"/>
-              <w:bottom w:w="70" w:type="dxa"/>
-              <w:right w:w="110" w:type="dxa"/>
-            </w:tcMar>
-            <w:vAlign w:val="center"/>
-          </w:tcPr>
-          <w:p>
-            <w:pPr>
-              <w:spacing w:after="20"/>
-            </w:pPr>
-            <w:r>
-              <w:rPr>
-                <w:sz w:val="20"/>
-                <w:szCs w:val="20"/>
-              </w:rPr>
-              <w:t>Drill-down: להוסיף יכולת drill (שיעור מיקומים לפי רמת תחרות → ענף). לבדוק מול מגבלות QuickSight</w:t>
-            </w:r>
-          </w:p>
-        </w:tc>
-        <w:tc>
-          <w:tcPr>
-            <w:tcW w:w="1240" w:type="dxa"/>
-            <w:tcBorders>
-              <w:top w:val="single" w:sz="4" w:space="0" w:color="C9D2DE"/>
-              <w:left w:val="single" w:sz="4" w:space="0" w:color="C9D2DE"/>
-              <w:bottom w:val="single" w:sz="4" w:space="0" w:color="C9D2DE"/>
-              <w:right w:val="single" w:sz="4" w:space="0" w:color="C9D2DE"/>
-            </w:tcBorders>
-            <w:shd w:val="clear" w:color="auto" w:fill="FBEFC4"/>
-            <w:tcMar>
-              <w:top w:w="70" w:type="dxa"/>
-              <w:left w:w="110" w:type="dxa"/>
-              <w:bottom w:w="70" w:type="dxa"/>
-              <w:right w:w="110" w:type="dxa"/>
-            </w:tcMar>
-            <w:vAlign w:val="center"/>
-          </w:tcPr>
-          <w:p>
-            <w:pPr>
-              <w:spacing w:after="20"/>
-              <w:jc w:val="center"/>
-            </w:pPr>
-            <w:r>
-              <w:rPr>
-                <w:b/>
-                <w:bCs/>
-                <w:sz w:val="20"/>
-                <w:szCs w:val="20"/>
-              </w:rPr>
-              <w:t>דורש דיון</w:t>
-            </w:r>
-          </w:p>
-        </w:tc>
-        <w:tc>
-          <w:tcPr>
-            <w:tcW w:w="2620" w:type="dxa"/>
-            <w:tcBorders>
-              <w:top w:val="single" w:sz="4" w:space="0" w:color="C9D2DE"/>
-              <w:left w:val="single" w:sz="4" w:space="0" w:color="C9D2DE"/>
-              <w:bottom w:val="single" w:sz="4" w:space="0" w:color="C9D2DE"/>
-              <w:right w:val="single" w:sz="4" w:space="0" w:color="C9D2DE"/>
-            </w:tcBorders>
-            <w:tcMar>
-              <w:top w:w="70" w:type="dxa"/>
-              <w:left w:w="110" w:type="dxa"/>
-              <w:bottom w:w="70" w:type="dxa"/>
-              <w:right w:w="110" w:type="dxa"/>
-            </w:tcMar>
-            <w:vAlign w:val="center"/>
-          </w:tcPr>
-          <w:p>
-            <w:pPr>
-              <w:spacing w:after="10"/>
-            </w:pPr>
-            <w:r>
-              <w:rPr>
-                <w:sz w:val="18"/>
-                <w:szCs w:val="18"/>
-              </w:rPr>
-              <w:t>• שיעור הצלחה לפי ענף</w:t>
-            </w:r>
-          </w:p>
-          <w:p>
-            <w:r>
-              <w:rPr>
-                <w:color w:val="9AA4B2"/>
-                <w:sz w:val="14"/>
-                <w:szCs w:val="14"/>
-              </w:rPr>
-              <w:t>c_success</w:t>
-            </w:r>
-          </w:p>
-        </w:tc>
-        <w:tc>
-          <w:tcPr>
-            <w:tcW w:w="1260" w:type="dxa"/>
-            <w:tcBorders>
-              <w:top w:val="single" w:sz="4" w:space="0" w:color="C9D2DE"/>
-              <w:left w:val="single" w:sz="4" w:space="0" w:color="C9D2DE"/>
-              <w:bottom w:val="single" w:sz="4" w:space="0" w:color="C9D2DE"/>
-              <w:right w:val="single" w:sz="4" w:space="0" w:color="C9D2DE"/>
-            </w:tcBorders>
-            <w:tcMar>
-              <w:top w:w="70" w:type="dxa"/>
-              <w:left w:w="110" w:type="dxa"/>
-              <w:bottom w:w="70" w:type="dxa"/>
-              <w:right w:w="110" w:type="dxa"/>
-            </w:tcMar>
-            <w:vAlign w:val="center"/>
-          </w:tcPr>
-          <w:p>
-            <w:pPr>
-              <w:spacing w:after="20"/>
-            </w:pPr>
-          </w:p>
-        </w:tc>
-      </w:tr>
-      <w:tr>
-        <w:tblPrEx>
-          <w:tblCellMar>
-            <w:top w:w="0" w:type="dxa"/>
-            <w:bottom w:w="0" w:type="dxa"/>
-          </w:tblCellMar>
-        </w:tblPrEx>
-        <w:trPr>
-          <w:cantSplit/>
-        </w:trPr>
-        <w:tc>
-          <w:tcPr>
-            <w:tcW w:w="560" w:type="dxa"/>
-            <w:tcBorders>
-              <w:top w:val="single" w:sz="4" w:space="0" w:color="C9D2DE"/>
-              <w:left w:val="single" w:sz="4" w:space="0" w:color="C9D2DE"/>
-              <w:bottom w:val="single" w:sz="4" w:space="0" w:color="C9D2DE"/>
-              <w:right w:val="single" w:sz="4" w:space="0" w:color="C9D2DE"/>
-            </w:tcBorders>
-            <w:tcMar>
-              <w:top w:w="70" w:type="dxa"/>
-              <w:left w:w="110" w:type="dxa"/>
-              <w:bottom w:w="70" w:type="dxa"/>
-              <w:right w:w="110" w:type="dxa"/>
-            </w:tcMar>
-            <w:vAlign w:val="center"/>
-          </w:tcPr>
-          <w:p>
-            <w:pPr>
-              <w:spacing w:after="20"/>
-              <w:jc w:val="center"/>
-            </w:pPr>
-            <w:r>
-              <w:rPr>
-                <w:b/>
-                <w:bCs/>
-                <w:sz w:val="20"/>
-                <w:szCs w:val="20"/>
-              </w:rPr>
-              <w:t>5</w:t>
-            </w:r>
-          </w:p>
-        </w:tc>
-        <w:tc>
-          <w:tcPr>
-            <w:tcW w:w="3680" w:type="dxa"/>
-            <w:tcBorders>
-              <w:top w:val="single" w:sz="4" w:space="0" w:color="C9D2DE"/>
-              <w:left w:val="single" w:sz="4" w:space="0" w:color="C9D2DE"/>
-              <w:bottom w:val="single" w:sz="4" w:space="0" w:color="C9D2DE"/>
-              <w:right w:val="single" w:sz="4" w:space="0" w:color="C9D2DE"/>
-            </w:tcBorders>
-            <w:tcMar>
-              <w:top w:w="70" w:type="dxa"/>
-              <w:left w:w="110" w:type="dxa"/>
-              <w:bottom w:w="70" w:type="dxa"/>
-              <w:right w:w="110" w:type="dxa"/>
-            </w:tcMar>
-            <w:vAlign w:val="center"/>
-          </w:tcPr>
-          <w:p>
-            <w:pPr>
-              <w:spacing w:after="20"/>
-            </w:pPr>
-            <w:r>
-              <w:rPr>
-                <w:sz w:val="20"/>
-                <w:szCs w:val="20"/>
-              </w:rPr>
-              <w:t>ענף מול איגוד — הערה גורפת לכל המסכים: האם החיתוך לפי ענף או איגוד?</w:t>
-            </w:r>
-          </w:p>
-          <w:p>
-            <w:pPr>
-              <w:spacing w:after="20"/>
-            </w:pPr>
-            <w:r>
-              <w:rPr>
-                <w:sz w:val="20"/>
-                <w:szCs w:val="20"/>
-              </w:rPr>
-              <w:t>אם איגוד — שמות מלאים + פתרון תצוגה; אם ענף — לציין בכותרת;</w:t>
-            </w:r>
-          </w:p>
-          <w:p>
-            <w:pPr>
-              <w:spacing w:after="20"/>
-            </w:pPr>
-            <w:r>
-              <w:rPr>
-                <w:sz w:val="20"/>
-                <w:szCs w:val="20"/>
-              </w:rPr>
-              <w:t>להגדיר מהו "מספר זכיות" (מדליות?) ומהו "מספר משתתפים"</w:t>
-            </w:r>
-          </w:p>
-        </w:tc>
-        <w:tc>
-          <w:tcPr>
-            <w:tcW w:w="1240" w:type="dxa"/>
-            <w:tcBorders>
-              <w:top w:val="single" w:sz="4" w:space="0" w:color="C9D2DE"/>
-              <w:left w:val="single" w:sz="4" w:space="0" w:color="C9D2DE"/>
-              <w:bottom w:val="single" w:sz="4" w:space="0" w:color="C9D2DE"/>
-              <w:right w:val="single" w:sz="4" w:space="0" w:color="C9D2DE"/>
-            </w:tcBorders>
-            <w:shd w:val="clear" w:color="auto" w:fill="FBEFC4"/>
-            <w:tcMar>
-              <w:top w:w="70" w:type="dxa"/>
-              <w:left w:w="110" w:type="dxa"/>
-              <w:bottom w:w="70" w:type="dxa"/>
-              <w:right w:w="110" w:type="dxa"/>
-            </w:tcMar>
-            <w:vAlign w:val="center"/>
-          </w:tcPr>
-          <w:p>
-            <w:pPr>
-              <w:spacing w:after="20"/>
-              <w:jc w:val="center"/>
-            </w:pPr>
-            <w:r>
-              <w:rPr>
-                <w:b/>
-                <w:bCs/>
-                <w:sz w:val="20"/>
-                <w:szCs w:val="20"/>
-              </w:rPr>
-              <w:t>דורש דיון</w:t>
-            </w:r>
-          </w:p>
-        </w:tc>
-        <w:tc>
-          <w:tcPr>
-            <w:tcW w:w="2620" w:type="dxa"/>
-            <w:tcBorders>
-              <w:top w:val="single" w:sz="4" w:space="0" w:color="C9D2DE"/>
-              <w:left w:val="single" w:sz="4" w:space="0" w:color="C9D2DE"/>
-              <w:bottom w:val="single" w:sz="4" w:space="0" w:color="C9D2DE"/>
-              <w:right w:val="single" w:sz="4" w:space="0" w:color="C9D2DE"/>
-            </w:tcBorders>
-            <w:tcMar>
-              <w:top w:w="70" w:type="dxa"/>
-              <w:left w:w="110" w:type="dxa"/>
-              <w:bottom w:w="70" w:type="dxa"/>
-              <w:right w:w="110" w:type="dxa"/>
-            </w:tcMar>
-            <w:vAlign w:val="center"/>
-          </w:tcPr>
-          <w:p>
-            <w:pPr>
-              <w:spacing w:after="10"/>
-            </w:pPr>
-            <w:r>
-              <w:rPr>
-                <w:sz w:val="18"/>
-                <w:szCs w:val="18"/>
-              </w:rPr>
-              <w:t>• זכיות לאורך השנים</w:t>
-            </w:r>
-          </w:p>
-          <w:p>
-            <w:pPr>
-              <w:spacing w:after="10"/>
-            </w:pPr>
-            <w:r>
-              <w:rPr>
-                <w:sz w:val="18"/>
-                <w:szCs w:val="18"/>
-              </w:rPr>
-              <w:t>• משתתפים לאורך השנים</w:t>
-            </w:r>
-          </w:p>
-          <w:p>
-            <w:pPr>
-              <w:spacing w:after="10"/>
-            </w:pPr>
-            <w:r>
-              <w:rPr>
-                <w:sz w:val="18"/>
-                <w:szCs w:val="18"/>
-              </w:rPr>
-              <w:t>• מדליות לפי איגוד</w:t>
-            </w:r>
-          </w:p>
-          <w:p>
-            <w:r>
-              <w:rPr>
-                <w:color w:val="9AA4B2"/>
-                <w:sz w:val="14"/>
-                <w:szCs w:val="14"/>
-              </w:rPr>
-              <w:t>c_years_wins, c_years_part, c_union_medals</w:t>
-            </w:r>
-          </w:p>
-        </w:tc>
-        <w:tc>
-          <w:tcPr>
-            <w:tcW w:w="1260" w:type="dxa"/>
-            <w:tcBorders>
-              <w:top w:val="single" w:sz="4" w:space="0" w:color="C9D2DE"/>
-              <w:left w:val="single" w:sz="4" w:space="0" w:color="C9D2DE"/>
-              <w:bottom w:val="single" w:sz="4" w:space="0" w:color="C9D2DE"/>
-              <w:right w:val="single" w:sz="4" w:space="0" w:color="C9D2DE"/>
-            </w:tcBorders>
-            <w:tcMar>
-              <w:top w:w="70" w:type="dxa"/>
-              <w:left w:w="110" w:type="dxa"/>
-              <w:bottom w:w="70" w:type="dxa"/>
-              <w:right w:w="110" w:type="dxa"/>
-            </w:tcMar>
-            <w:vAlign w:val="center"/>
-          </w:tcPr>
-          <w:p>
-            <w:pPr>
-              <w:spacing w:after="20"/>
-            </w:pPr>
-          </w:p>
-        </w:tc>
-      </w:tr>
-      <w:tr>
-        <w:tblPrEx>
-          <w:tblCellMar>
-            <w:top w:w="0" w:type="dxa"/>
-            <w:bottom w:w="0" w:type="dxa"/>
-          </w:tblCellMar>
-        </w:tblPrEx>
-        <w:trPr>
-          <w:cantSplit/>
-        </w:trPr>
-        <w:tc>
-          <w:tcPr>
-            <w:tcW w:w="560" w:type="dxa"/>
-            <w:tcBorders>
-              <w:top w:val="single" w:sz="4" w:space="0" w:color="C9D2DE"/>
-              <w:left w:val="single" w:sz="4" w:space="0" w:color="C9D2DE"/>
-              <w:bottom w:val="single" w:sz="4" w:space="0" w:color="C9D2DE"/>
-              <w:right w:val="single" w:sz="4" w:space="0" w:color="C9D2DE"/>
-            </w:tcBorders>
-            <w:tcMar>
-              <w:top w:w="70" w:type="dxa"/>
-              <w:left w:w="110" w:type="dxa"/>
-              <w:bottom w:w="70" w:type="dxa"/>
-              <w:right w:w="110" w:type="dxa"/>
-            </w:tcMar>
-            <w:vAlign w:val="center"/>
-          </w:tcPr>
-          <w:p>
-            <w:pPr>
-              <w:spacing w:after="20"/>
-              <w:jc w:val="center"/>
-            </w:pPr>
-            <w:r>
-              <w:rPr>
-                <w:b/>
-                <w:bCs/>
-                <w:sz w:val="20"/>
-                <w:szCs w:val="20"/>
-              </w:rPr>
-              <w:t>6</w:t>
-            </w:r>
-          </w:p>
-        </w:tc>
-        <w:tc>
-          <w:tcPr>
-            <w:tcW w:w="3680" w:type="dxa"/>
-            <w:tcBorders>
-              <w:top w:val="single" w:sz="4" w:space="0" w:color="C9D2DE"/>
-              <w:left w:val="single" w:sz="4" w:space="0" w:color="C9D2DE"/>
-              <w:bottom w:val="single" w:sz="4" w:space="0" w:color="C9D2DE"/>
-              <w:right w:val="single" w:sz="4" w:space="0" w:color="C9D2DE"/>
-            </w:tcBorders>
-            <w:tcMar>
-              <w:top w:w="70" w:type="dxa"/>
-              <w:left w:w="110" w:type="dxa"/>
-              <w:bottom w:w="70" w:type="dxa"/>
-              <w:right w:w="110" w:type="dxa"/>
-            </w:tcMar>
-            <w:vAlign w:val="center"/>
-          </w:tcPr>
-          <w:p>
-            <w:pPr>
-              <w:spacing w:after="20"/>
-            </w:pPr>
-            <w:r>
-              <w:rPr>
-                <w:sz w:val="20"/>
-                <w:szCs w:val="20"/>
-              </w:rPr>
-              <w:t>סינון שכבות גיל: הורדת "נערות/קדטיות" ברורה, אך הסינון הספציפי-למגדר הוא שינוי לוגיקה — לאשר</w:t>
-            </w:r>
-          </w:p>
-        </w:tc>
-        <w:tc>
-          <w:tcPr>
-            <w:tcW w:w="1240" w:type="dxa"/>
-            <w:tcBorders>
-              <w:top w:val="single" w:sz="4" w:space="0" w:color="C9D2DE"/>
-              <w:left w:val="single" w:sz="4" w:space="0" w:color="C9D2DE"/>
-              <w:bottom w:val="single" w:sz="4" w:space="0" w:color="C9D2DE"/>
-              <w:right w:val="single" w:sz="4" w:space="0" w:color="C9D2DE"/>
-            </w:tcBorders>
-            <w:shd w:val="clear" w:color="auto" w:fill="E2E7EC"/>
-            <w:tcMar>
-              <w:top w:w="70" w:type="dxa"/>
-              <w:left w:w="110" w:type="dxa"/>
-              <w:bottom w:w="70" w:type="dxa"/>
-              <w:right w:w="110" w:type="dxa"/>
-            </w:tcMar>
-            <w:vAlign w:val="center"/>
-          </w:tcPr>
-          <w:p>
-            <w:pPr>
-              <w:spacing w:after="20"/>
-              <w:jc w:val="center"/>
-            </w:pPr>
-            <w:r>
-              <w:rPr>
-                <w:b/>
-                <w:bCs/>
-                <w:sz w:val="20"/>
-                <w:szCs w:val="20"/>
-              </w:rPr>
-              <w:t>לא בטוח</w:t>
-            </w:r>
-          </w:p>
-        </w:tc>
-        <w:tc>
-          <w:tcPr>
-            <w:tcW w:w="2620" w:type="dxa"/>
-            <w:tcBorders>
-              <w:top w:val="single" w:sz="4" w:space="0" w:color="C9D2DE"/>
-              <w:left w:val="single" w:sz="4" w:space="0" w:color="C9D2DE"/>
-              <w:bottom w:val="single" w:sz="4" w:space="0" w:color="C9D2DE"/>
-              <w:right w:val="single" w:sz="4" w:space="0" w:color="C9D2DE"/>
-            </w:tcBorders>
-            <w:tcMar>
-              <w:top w:w="70" w:type="dxa"/>
-              <w:left w:w="110" w:type="dxa"/>
-              <w:bottom w:w="70" w:type="dxa"/>
-              <w:right w:w="110" w:type="dxa"/>
-            </w:tcMar>
-            <w:vAlign w:val="center"/>
-          </w:tcPr>
-          <w:p>
-            <w:pPr>
-              <w:spacing w:after="10"/>
-            </w:pPr>
-            <w:r>
-              <w:rPr>
-                <w:sz w:val="18"/>
-                <w:szCs w:val="18"/>
-              </w:rPr>
-              <w:t>• ניקוד לפי ענף</w:t>
-            </w:r>
-          </w:p>
-          <w:p>
-            <w:r>
-              <w:rPr>
-                <w:color w:val="9AA4B2"/>
-                <w:sz w:val="14"/>
-                <w:szCs w:val="14"/>
-              </w:rPr>
-              <w:t>c_branch</w:t>
-            </w:r>
-          </w:p>
-        </w:tc>
-        <w:tc>
-          <w:tcPr>
-            <w:tcW w:w="1260" w:type="dxa"/>
-            <w:tcBorders>
-              <w:top w:val="single" w:sz="4" w:space="0" w:color="C9D2DE"/>
-              <w:left w:val="single" w:sz="4" w:space="0" w:color="C9D2DE"/>
-              <w:bottom w:val="single" w:sz="4" w:space="0" w:color="C9D2DE"/>
-              <w:right w:val="single" w:sz="4" w:space="0" w:color="C9D2DE"/>
-            </w:tcBorders>
-            <w:tcMar>
-              <w:top w:w="70" w:type="dxa"/>
-              <w:left w:w="110" w:type="dxa"/>
-              <w:bottom w:w="70" w:type="dxa"/>
-              <w:right w:w="110" w:type="dxa"/>
-            </w:tcMar>
-            <w:vAlign w:val="center"/>
-          </w:tcPr>
-          <w:p>
-            <w:pPr>
-              <w:spacing w:after="20"/>
-            </w:pPr>
-          </w:p>
-        </w:tc>
-      </w:tr>
-    </w:tbl>
-    <w:p>
-      <w:pPr>
-        <w:spacing w:before="240"/>
-      </w:pPr>
-      <w:r>
-        <w:rPr>
-          <w:b/>
-          <w:bCs/>
-          <w:color w:val="DA3439"/>
-        </w:rPr>
-        <w:t>נושא רוחבי מרכזי לפתיחת הפגישה: ההכרעה "ענף מול איגוד" — חוזרת בהישגיות ומשפיעה על כותרות בכל המסכים.</w:t>
-      </w:r>
     </w:p>
     <w:sectPr>
       <w:pgSz w:w="11906" w:h="16838"/>
@@ -6952,7 +5438,7 @@
         <w:sz w:val="22"/>
         <w:szCs w:val="22"/>
         <w:rtl/>
-        <w:lang w:val="en-IL" w:eastAsia="en-IL" w:bidi="he-IL"/>
+        <w:lang w:bidi="he-IL"/>
       </w:rPr>
     </w:rPrDefault>
     <w:pPrDefault>

</xml_diff>